<commit_message>
feat: port Mercado Pago subscription system from v1, including renewal logic, ProfileScreen, and payment workflow enhancements.
</commit_message>
<xml_diff>
--- a/Guia final Web App Flightlog con roster ARMS.docx
+++ b/Guia final Web App Flightlog con roster ARMS.docx
@@ -856,24 +856,17 @@
         </w:rPr>
         <w:br w:type="page"/>
       </w:r>
-      <w:proofErr w:type="spellStart"/>
       <w:r>
         <w:rPr>
           <w:lang w:val="es-AR"/>
         </w:rPr>
         <w:lastRenderedPageBreak/>
-        <w:t>FlightLog</w:t>
-      </w:r>
-      <w:proofErr w:type="spellEnd"/>
-      <w:r>
-        <w:rPr>
-          <w:lang w:val="es-AR"/>
-        </w:rPr>
-        <w:t xml:space="preserve"> Guía de Usuario</w:t>
-      </w:r>
-    </w:p>
-    <w:p>
-      <w:pPr>
+        <w:t>FlightLog Guía de Usuario</w:t>
+      </w:r>
+    </w:p>
+    <w:p>
+      <w:pPr>
+        <w:pStyle w:val="Ttulo1"/>
         <w:rPr>
           <w:lang w:val="es-AR"/>
         </w:rPr>
@@ -891,19 +884,131 @@
           <w:lang w:val="es-AR"/>
         </w:rPr>
       </w:pPr>
-      <w:proofErr w:type="spellStart"/>
-      <w:r>
-        <w:rPr>
-          <w:lang w:val="es-AR"/>
-        </w:rPr>
-        <w:t>FlightLog</w:t>
-      </w:r>
-      <w:proofErr w:type="spellEnd"/>
-      <w:r>
-        <w:rPr>
-          <w:lang w:val="es-AR"/>
-        </w:rPr>
-        <w:t xml:space="preserve"> permite registrar, consultar, consolidar y exportar horas de vuelo, además de sincronizar información con ANAC.</w:t>
+      <w:r>
+        <w:rPr>
+          <w:lang w:val="es-AR"/>
+        </w:rPr>
+        <w:t xml:space="preserve">FlightLog </w:t>
+      </w:r>
+      <w:r>
+        <w:rPr>
+          <w:lang w:val="es-AR"/>
+        </w:rPr>
+        <w:t>fue desarrollada con las siguientes características:</w:t>
+      </w:r>
+    </w:p>
+    <w:p>
+      <w:pPr>
+        <w:pStyle w:val="Prrafodelista"/>
+        <w:numPr>
+          <w:ilvl w:val="0"/>
+          <w:numId w:val="4"/>
+        </w:numPr>
+        <w:rPr>
+          <w:lang w:val="es-AR"/>
+        </w:rPr>
+      </w:pPr>
+      <w:r>
+        <w:rPr>
+          <w:lang w:val="es-AR"/>
+        </w:rPr>
+        <w:t>R</w:t>
+      </w:r>
+      <w:r>
+        <w:rPr>
+          <w:lang w:val="es-AR"/>
+        </w:rPr>
+        <w:t>egistr</w:t>
+      </w:r>
+      <w:r>
+        <w:rPr>
+          <w:lang w:val="es-AR"/>
+        </w:rPr>
+        <w:t>o</w:t>
+      </w:r>
+      <w:r>
+        <w:rPr>
+          <w:lang w:val="es-AR"/>
+        </w:rPr>
+        <w:t>, consulta, consolida</w:t>
+      </w:r>
+      <w:r>
+        <w:rPr>
+          <w:lang w:val="es-AR"/>
+        </w:rPr>
+        <w:t>ción</w:t>
+      </w:r>
+      <w:r>
+        <w:rPr>
+          <w:lang w:val="es-AR"/>
+        </w:rPr>
+        <w:t xml:space="preserve"> y exporta</w:t>
+      </w:r>
+      <w:r>
+        <w:rPr>
+          <w:lang w:val="es-AR"/>
+        </w:rPr>
+        <w:t>ción de</w:t>
+      </w:r>
+      <w:r>
+        <w:rPr>
+          <w:lang w:val="es-AR"/>
+        </w:rPr>
+        <w:t xml:space="preserve"> horas de vuelo, además de sincronizar información con ANAC.</w:t>
+      </w:r>
+    </w:p>
+    <w:p>
+      <w:pPr>
+        <w:pStyle w:val="Prrafodelista"/>
+        <w:numPr>
+          <w:ilvl w:val="0"/>
+          <w:numId w:val="4"/>
+        </w:numPr>
+        <w:rPr>
+          <w:lang w:val="es-AR"/>
+        </w:rPr>
+      </w:pPr>
+      <w:r>
+        <w:rPr>
+          <w:lang w:val="es-AR"/>
+        </w:rPr>
+        <w:t xml:space="preserve">Calculo de los tiempos de servicio y descanso de las tripulaciones de acuerdo al </w:t>
+      </w:r>
+      <w:r>
+        <w:rPr>
+          <w:lang w:val="es-AR"/>
+        </w:rPr>
+        <w:t>Decreto 378/2025</w:t>
+      </w:r>
+      <w:r>
+        <w:rPr>
+          <w:lang w:val="es-AR"/>
+        </w:rPr>
+        <w:t xml:space="preserve"> </w:t>
+      </w:r>
+      <w:r>
+        <w:rPr>
+          <w:lang w:val="es-AR"/>
+        </w:rPr>
+        <w:t xml:space="preserve">Anexo I. </w:t>
+      </w:r>
+    </w:p>
+    <w:p>
+      <w:pPr>
+        <w:pStyle w:val="Prrafodelista"/>
+        <w:numPr>
+          <w:ilvl w:val="0"/>
+          <w:numId w:val="4"/>
+        </w:numPr>
+        <w:rPr>
+          <w:lang w:val="es-AR"/>
+        </w:rPr>
+      </w:pPr>
+      <w:r>
+        <w:rPr>
+          <w:lang w:val="es-AR"/>
+        </w:rPr>
+        <w:t>Sincronización la actividad de vuelo con el portar ARMS y capacidad de exportar la actividad en calendario PDF, calendario estático  .ICS o calendario dinámico mediante URL para compartir con otras personas.</w:t>
       </w:r>
     </w:p>
     <w:p>
@@ -1108,6 +1213,7 @@
         <w:rPr>
           <w:lang w:val="es-AR"/>
         </w:rPr>
+        <w:lastRenderedPageBreak/>
         <w:br w:type="page"/>
       </w:r>
     </w:p>
@@ -2401,7 +2507,7 @@
         <mc:AlternateContent>
           <mc:Choice Requires="wpg">
             <w:drawing>
-              <wp:anchor distT="0" distB="0" distL="114300" distR="114300" simplePos="0" relativeHeight="251668480" behindDoc="0" locked="0" layoutInCell="1" allowOverlap="1" wp14:anchorId="19E1B37A" wp14:editId="5CABA7AD">
+              <wp:anchor distT="0" distB="0" distL="114300" distR="114300" simplePos="0" relativeHeight="251668480" behindDoc="0" locked="0" layoutInCell="1" allowOverlap="1" wp14:anchorId="19E1B37A" wp14:editId="57511115">
                 <wp:simplePos x="0" y="0"/>
                 <wp:positionH relativeFrom="column">
                   <wp:posOffset>1905</wp:posOffset>
@@ -2942,6 +3048,7 @@
       </w:pPr>
       <w:r>
         <w:rPr>
+          <w:noProof/>
           <w:lang w:val="es-AR"/>
         </w:rPr>
         <w:drawing>
@@ -3145,6 +3252,119 @@
 <file path=word/numbering.xml><?xml version="1.0" encoding="utf-8"?>
 <w:numbering xmlns:wpc="http://schemas.microsoft.com/office/word/2010/wordprocessingCanvas" xmlns:cx="http://schemas.microsoft.com/office/drawing/2014/chartex" xmlns:cx1="http://schemas.microsoft.com/office/drawing/2015/9/8/chartex" xmlns:cx2="http://schemas.microsoft.com/office/drawing/2015/10/21/chartex" xmlns:cx3="http://schemas.microsoft.com/office/drawing/2016/5/9/chartex" xmlns:cx4="http://schemas.microsoft.com/office/drawing/2016/5/10/chartex" xmlns:cx5="http://schemas.microsoft.com/office/drawing/2016/5/11/chartex" xmlns:cx6="http://schemas.microsoft.com/office/drawing/2016/5/12/chartex" xmlns:cx7="http://schemas.microsoft.com/office/drawing/2016/5/13/chartex" xmlns:cx8="http://schemas.microsoft.com/office/drawing/2016/5/14/chartex" xmlns:mc="http://schemas.openxmlformats.org/markup-compatibility/2006" xmlns:aink="http://schemas.microsoft.com/office/drawing/2016/ink" xmlns:am3d="http://schemas.microsoft.com/office/drawing/2017/model3d" xmlns:o="urn:schemas-microsoft-com:office:office" xmlns:oel="http://schemas.microsoft.com/office/2019/extlst" xmlns:r="http://schemas.openxmlformats.org/officeDocument/2006/relationships" xmlns:m="http://schemas.openxmlformats.org/officeDocument/2006/math" xmlns:v="urn:schemas-microsoft-com:vml" xmlns:wp14="http://schemas.microsoft.com/office/word/2010/wordprocessingDrawing" xmlns:wp="http://schemas.openxmlformats.org/drawingml/2006/wordprocessingDrawing" xmlns:w10="urn:schemas-microsoft-com:office:word" xmlns:w="http://schemas.openxmlformats.org/wordprocessingml/2006/main" xmlns:w14="http://schemas.microsoft.com/office/word/2010/wordml" xmlns:w15="http://schemas.microsoft.com/office/word/2012/wordml" xmlns:w16cex="http://schemas.microsoft.com/office/word/2018/wordml/cex" xmlns:w16cid="http://schemas.microsoft.com/office/word/2016/wordml/cid" xmlns:w16="http://schemas.microsoft.com/office/word/2018/wordml" xmlns:w16du="http://schemas.microsoft.com/office/word/2023/wordml/word16du" xmlns:w16sdtdh="http://schemas.microsoft.com/office/word/2020/wordml/sdtdatahash" xmlns:w16sdtfl="http://schemas.microsoft.com/office/word/2024/wordml/sdtformatlock" xmlns:w16se="http://schemas.microsoft.com/office/word/2015/wordml/symex" xmlns:wpg="http://schemas.microsoft.com/office/word/2010/wordprocessingGroup" xmlns:wpi="http://schemas.microsoft.com/office/word/2010/wordprocessingInk" xmlns:wne="http://schemas.microsoft.com/office/word/2006/wordml" xmlns:wps="http://schemas.microsoft.com/office/word/2010/wordprocessingShape" mc:Ignorable="w14 w15 w16se w16cid w16 w16cex w16sdtdh w16sdtfl w16du wp14">
   <w:abstractNum w:abstractNumId="0" w15:restartNumberingAfterBreak="0">
+    <w:nsid w:val="067F6738"/>
+    <w:multiLevelType w:val="hybridMultilevel"/>
+    <w:tmpl w:val="1918FDB8"/>
+    <w:lvl w:ilvl="0" w:tplc="2C0A0001">
+      <w:start w:val="1"/>
+      <w:numFmt w:val="bullet"/>
+      <w:lvlText w:val=""/>
+      <w:lvlJc w:val="left"/>
+      <w:pPr>
+        <w:ind w:left="720" w:hanging="360"/>
+      </w:pPr>
+      <w:rPr>
+        <w:rFonts w:ascii="Symbol" w:hAnsi="Symbol" w:hint="default"/>
+      </w:rPr>
+    </w:lvl>
+    <w:lvl w:ilvl="1" w:tplc="2C0A0003" w:tentative="1">
+      <w:start w:val="1"/>
+      <w:numFmt w:val="bullet"/>
+      <w:lvlText w:val="o"/>
+      <w:lvlJc w:val="left"/>
+      <w:pPr>
+        <w:ind w:left="1440" w:hanging="360"/>
+      </w:pPr>
+      <w:rPr>
+        <w:rFonts w:ascii="Courier New" w:hAnsi="Courier New" w:cs="Courier New" w:hint="default"/>
+      </w:rPr>
+    </w:lvl>
+    <w:lvl w:ilvl="2" w:tplc="2C0A0005" w:tentative="1">
+      <w:start w:val="1"/>
+      <w:numFmt w:val="bullet"/>
+      <w:lvlText w:val=""/>
+      <w:lvlJc w:val="left"/>
+      <w:pPr>
+        <w:ind w:left="2160" w:hanging="360"/>
+      </w:pPr>
+      <w:rPr>
+        <w:rFonts w:ascii="Wingdings" w:hAnsi="Wingdings" w:hint="default"/>
+      </w:rPr>
+    </w:lvl>
+    <w:lvl w:ilvl="3" w:tplc="2C0A0001" w:tentative="1">
+      <w:start w:val="1"/>
+      <w:numFmt w:val="bullet"/>
+      <w:lvlText w:val=""/>
+      <w:lvlJc w:val="left"/>
+      <w:pPr>
+        <w:ind w:left="2880" w:hanging="360"/>
+      </w:pPr>
+      <w:rPr>
+        <w:rFonts w:ascii="Symbol" w:hAnsi="Symbol" w:hint="default"/>
+      </w:rPr>
+    </w:lvl>
+    <w:lvl w:ilvl="4" w:tplc="2C0A0003" w:tentative="1">
+      <w:start w:val="1"/>
+      <w:numFmt w:val="bullet"/>
+      <w:lvlText w:val="o"/>
+      <w:lvlJc w:val="left"/>
+      <w:pPr>
+        <w:ind w:left="3600" w:hanging="360"/>
+      </w:pPr>
+      <w:rPr>
+        <w:rFonts w:ascii="Courier New" w:hAnsi="Courier New" w:cs="Courier New" w:hint="default"/>
+      </w:rPr>
+    </w:lvl>
+    <w:lvl w:ilvl="5" w:tplc="2C0A0005" w:tentative="1">
+      <w:start w:val="1"/>
+      <w:numFmt w:val="bullet"/>
+      <w:lvlText w:val=""/>
+      <w:lvlJc w:val="left"/>
+      <w:pPr>
+        <w:ind w:left="4320" w:hanging="360"/>
+      </w:pPr>
+      <w:rPr>
+        <w:rFonts w:ascii="Wingdings" w:hAnsi="Wingdings" w:hint="default"/>
+      </w:rPr>
+    </w:lvl>
+    <w:lvl w:ilvl="6" w:tplc="2C0A0001" w:tentative="1">
+      <w:start w:val="1"/>
+      <w:numFmt w:val="bullet"/>
+      <w:lvlText w:val=""/>
+      <w:lvlJc w:val="left"/>
+      <w:pPr>
+        <w:ind w:left="5040" w:hanging="360"/>
+      </w:pPr>
+      <w:rPr>
+        <w:rFonts w:ascii="Symbol" w:hAnsi="Symbol" w:hint="default"/>
+      </w:rPr>
+    </w:lvl>
+    <w:lvl w:ilvl="7" w:tplc="2C0A0003" w:tentative="1">
+      <w:start w:val="1"/>
+      <w:numFmt w:val="bullet"/>
+      <w:lvlText w:val="o"/>
+      <w:lvlJc w:val="left"/>
+      <w:pPr>
+        <w:ind w:left="5760" w:hanging="360"/>
+      </w:pPr>
+      <w:rPr>
+        <w:rFonts w:ascii="Courier New" w:hAnsi="Courier New" w:cs="Courier New" w:hint="default"/>
+      </w:rPr>
+    </w:lvl>
+    <w:lvl w:ilvl="8" w:tplc="2C0A0005" w:tentative="1">
+      <w:start w:val="1"/>
+      <w:numFmt w:val="bullet"/>
+      <w:lvlText w:val=""/>
+      <w:lvlJc w:val="left"/>
+      <w:pPr>
+        <w:ind w:left="6480" w:hanging="360"/>
+      </w:pPr>
+      <w:rPr>
+        <w:rFonts w:ascii="Wingdings" w:hAnsi="Wingdings" w:hint="default"/>
+      </w:rPr>
+    </w:lvl>
+  </w:abstractNum>
+  <w:abstractNum w:abstractNumId="1" w15:restartNumberingAfterBreak="0">
     <w:nsid w:val="1B622889"/>
     <w:multiLevelType w:val="multilevel"/>
     <w:tmpl w:val="A93A8AB8"/>
@@ -3257,7 +3477,7 @@
       </w:pPr>
     </w:lvl>
   </w:abstractNum>
-  <w:abstractNum w:abstractNumId="1" w15:restartNumberingAfterBreak="0">
+  <w:abstractNum w:abstractNumId="2" w15:restartNumberingAfterBreak="0">
     <w:nsid w:val="453B2F1E"/>
     <w:multiLevelType w:val="multilevel"/>
     <w:tmpl w:val="AC362B08"/>
@@ -3370,7 +3590,7 @@
       </w:pPr>
     </w:lvl>
   </w:abstractNum>
-  <w:abstractNum w:abstractNumId="2" w15:restartNumberingAfterBreak="0">
+  <w:abstractNum w:abstractNumId="3" w15:restartNumberingAfterBreak="0">
     <w:nsid w:val="505478B0"/>
     <w:multiLevelType w:val="multilevel"/>
     <w:tmpl w:val="B11865BA"/>
@@ -3484,13 +3704,16 @@
     </w:lvl>
   </w:abstractNum>
   <w:num w:numId="1" w16cid:durableId="284120353">
+    <w:abstractNumId w:val="2"/>
+  </w:num>
+  <w:num w:numId="2" w16cid:durableId="487476233">
     <w:abstractNumId w:val="1"/>
   </w:num>
-  <w:num w:numId="2" w16cid:durableId="487476233">
+  <w:num w:numId="3" w16cid:durableId="19286702">
+    <w:abstractNumId w:val="3"/>
+  </w:num>
+  <w:num w:numId="4" w16cid:durableId="1157570264">
     <w:abstractNumId w:val="0"/>
-  </w:num>
-  <w:num w:numId="3" w16cid:durableId="19286702">
-    <w:abstractNumId w:val="2"/>
   </w:num>
 </w:numbering>
 </file>

</xml_diff>